<commit_message>
Update IEEE manuscript author details
</commit_message>
<xml_diff>
--- a/paper/EpiControl_AI_IEEE_Manuscript.docx
+++ b/paper/EpiControl_AI_IEEE_Manuscript.docx
@@ -15,38 +15,421 @@
         <w:t>for Adaptive Intervention Analysis</w:t>
       </w:r>
     </w:p>
+    <w:tbl>
+      <w:tblPr>
+        <w:tblW w:type="auto" w:w="0"/>
+        <w:jc w:val="center"/>
+        <w:tblLayout w:type="fixed"/>
+        <w:tblLook w:firstColumn="1" w:firstRow="1" w:lastColumn="0" w:lastRow="0" w:noHBand="0" w:noVBand="1" w:val="04A0"/>
+      </w:tblPr>
+      <w:tblGrid>
+        <w:gridCol w:w="3273"/>
+        <w:gridCol w:w="3273"/>
+        <w:gridCol w:w="3273"/>
+      </w:tblGrid>
+      <w:tr>
+        <w:tc>
+          <w:tcPr>
+            <w:tcW w:type="dxa" w:w="3427"/>
+            <w:vAlign w:val="top"/>
+            <w:tcBorders>
+              <w:top w:val="nil"/>
+              <w:bottom w:val="nil"/>
+              <w:left w:val="nil"/>
+              <w:right w:val="nil"/>
+              <w:insideH w:val="nil"/>
+              <w:insideV w:val="nil"/>
+            </w:tcBorders>
+            <w:tcMar>
+              <w:top w:w="55" w:type="dxa"/>
+              <w:bottom w:w="55" w:type="dxa"/>
+              <w:left w:w="55" w:type="dxa"/>
+              <w:right w:w="55" w:type="dxa"/>
+            </w:tcMar>
+          </w:tcPr>
+          <w:p>
+            <w:pPr>
+              <w:spacing w:after="0" w:line="240" w:lineRule="auto"/>
+              <w:jc w:val="center"/>
+            </w:pPr>
+            <w:r/>
+            <w:r>
+              <w:rPr>
+                <w:rFonts w:ascii="Times New Roman" w:hAnsi="Times New Roman"/>
+                <w:i w:val="0"/>
+                <w:sz w:val="19"/>
+              </w:rPr>
+              <w:t>Prof Bhagyashri Thorat</w:t>
+              <w:br/>
+            </w:r>
+            <w:r>
+              <w:rPr>
+                <w:rFonts w:ascii="Times New Roman" w:hAnsi="Times New Roman"/>
+                <w:i w:val="0"/>
+                <w:sz w:val="19"/>
+              </w:rPr>
+              <w:t>Department of Electronics and</w:t>
+              <w:br/>
+              <w:t>Telecommunication</w:t>
+              <w:br/>
+            </w:r>
+            <w:r>
+              <w:rPr>
+                <w:rFonts w:ascii="Times New Roman" w:hAnsi="Times New Roman"/>
+                <w:i w:val="0"/>
+                <w:sz w:val="19"/>
+              </w:rPr>
+              <w:t>International Institute Of Information</w:t>
+              <w:br/>
+              <w:t>Technology</w:t>
+              <w:br/>
+            </w:r>
+            <w:r>
+              <w:rPr>
+                <w:rFonts w:ascii="Times New Roman" w:hAnsi="Times New Roman"/>
+                <w:i/>
+                <w:sz w:val="19"/>
+              </w:rPr>
+              <w:t>Pune, India</w:t>
+              <w:br/>
+            </w:r>
+            <w:r>
+              <w:rPr>
+                <w:rFonts w:ascii="Times New Roman" w:hAnsi="Times New Roman"/>
+                <w:i w:val="0"/>
+                <w:sz w:val="19"/>
+              </w:rPr>
+              <w:t>email</w:t>
+            </w:r>
+          </w:p>
+        </w:tc>
+        <w:tc>
+          <w:tcPr>
+            <w:tcW w:type="dxa" w:w="3427"/>
+            <w:vAlign w:val="top"/>
+            <w:tcBorders>
+              <w:top w:val="nil"/>
+              <w:bottom w:val="nil"/>
+              <w:left w:val="nil"/>
+              <w:right w:val="nil"/>
+              <w:insideH w:val="nil"/>
+              <w:insideV w:val="nil"/>
+            </w:tcBorders>
+            <w:tcMar>
+              <w:top w:w="55" w:type="dxa"/>
+              <w:bottom w:w="55" w:type="dxa"/>
+              <w:left w:w="55" w:type="dxa"/>
+              <w:right w:w="55" w:type="dxa"/>
+            </w:tcMar>
+          </w:tcPr>
+          <w:p>
+            <w:pPr>
+              <w:spacing w:after="0" w:line="240" w:lineRule="auto"/>
+              <w:jc w:val="center"/>
+            </w:pPr>
+            <w:r/>
+            <w:r>
+              <w:rPr>
+                <w:rFonts w:ascii="Times New Roman" w:hAnsi="Times New Roman"/>
+                <w:i w:val="0"/>
+                <w:sz w:val="19"/>
+              </w:rPr>
+              <w:t>Parth Omprakash Bhad</w:t>
+              <w:br/>
+            </w:r>
+            <w:r>
+              <w:rPr>
+                <w:rFonts w:ascii="Times New Roman" w:hAnsi="Times New Roman"/>
+                <w:i w:val="0"/>
+                <w:sz w:val="19"/>
+              </w:rPr>
+              <w:t>Department of Computer Engineering</w:t>
+              <w:br/>
+            </w:r>
+            <w:r>
+              <w:rPr>
+                <w:rFonts w:ascii="Times New Roman" w:hAnsi="Times New Roman"/>
+                <w:i w:val="0"/>
+                <w:sz w:val="19"/>
+              </w:rPr>
+              <w:t>International Institute Of Information</w:t>
+              <w:br/>
+              <w:t>Technology</w:t>
+              <w:br/>
+            </w:r>
+            <w:r>
+              <w:rPr>
+                <w:rFonts w:ascii="Times New Roman" w:hAnsi="Times New Roman"/>
+                <w:i/>
+                <w:sz w:val="19"/>
+              </w:rPr>
+              <w:t>Pune, India</w:t>
+              <w:br/>
+            </w:r>
+            <w:r>
+              <w:rPr>
+                <w:rFonts w:ascii="Times New Roman" w:hAnsi="Times New Roman"/>
+                <w:i w:val="0"/>
+                <w:sz w:val="19"/>
+              </w:rPr>
+              <w:t>parthbhad2@gmail.com</w:t>
+            </w:r>
+          </w:p>
+        </w:tc>
+        <w:tc>
+          <w:tcPr>
+            <w:tcW w:type="dxa" w:w="3427"/>
+            <w:vAlign w:val="top"/>
+            <w:tcBorders>
+              <w:top w:val="nil"/>
+              <w:bottom w:val="nil"/>
+              <w:left w:val="nil"/>
+              <w:right w:val="nil"/>
+              <w:insideH w:val="nil"/>
+              <w:insideV w:val="nil"/>
+            </w:tcBorders>
+            <w:tcMar>
+              <w:top w:w="55" w:type="dxa"/>
+              <w:bottom w:w="55" w:type="dxa"/>
+              <w:left w:w="55" w:type="dxa"/>
+              <w:right w:w="55" w:type="dxa"/>
+            </w:tcMar>
+          </w:tcPr>
+          <w:p>
+            <w:pPr>
+              <w:spacing w:after="0" w:line="240" w:lineRule="auto"/>
+              <w:jc w:val="center"/>
+            </w:pPr>
+            <w:r/>
+            <w:r>
+              <w:rPr>
+                <w:rFonts w:ascii="Times New Roman" w:hAnsi="Times New Roman"/>
+                <w:i w:val="0"/>
+                <w:sz w:val="19"/>
+              </w:rPr>
+              <w:t>Aaditya Shrikrishna Hingmire</w:t>
+              <w:br/>
+            </w:r>
+            <w:r>
+              <w:rPr>
+                <w:rFonts w:ascii="Times New Roman" w:hAnsi="Times New Roman"/>
+                <w:i w:val="0"/>
+                <w:sz w:val="19"/>
+              </w:rPr>
+              <w:t>Department of Information Technology</w:t>
+              <w:br/>
+            </w:r>
+            <w:r>
+              <w:rPr>
+                <w:rFonts w:ascii="Times New Roman" w:hAnsi="Times New Roman"/>
+                <w:i w:val="0"/>
+                <w:sz w:val="19"/>
+              </w:rPr>
+              <w:t>International Institute Of Information</w:t>
+              <w:br/>
+              <w:t>Technology</w:t>
+              <w:br/>
+            </w:r>
+            <w:r>
+              <w:rPr>
+                <w:rFonts w:ascii="Times New Roman" w:hAnsi="Times New Roman"/>
+                <w:i/>
+                <w:sz w:val="19"/>
+              </w:rPr>
+              <w:t>Pune, India</w:t>
+              <w:br/>
+            </w:r>
+            <w:r>
+              <w:rPr>
+                <w:rFonts w:ascii="Times New Roman" w:hAnsi="Times New Roman"/>
+                <w:i w:val="0"/>
+                <w:sz w:val="19"/>
+              </w:rPr>
+              <w:t>aadityahingmire@gmail.com</w:t>
+            </w:r>
+          </w:p>
+        </w:tc>
+      </w:tr>
+      <w:tr>
+        <w:tc>
+          <w:tcPr>
+            <w:tcW w:type="dxa" w:w="3427"/>
+            <w:vAlign w:val="top"/>
+            <w:tcBorders>
+              <w:top w:val="nil"/>
+              <w:bottom w:val="nil"/>
+              <w:left w:val="nil"/>
+              <w:right w:val="nil"/>
+              <w:insideH w:val="nil"/>
+              <w:insideV w:val="nil"/>
+            </w:tcBorders>
+            <w:tcMar>
+              <w:top w:w="55" w:type="dxa"/>
+              <w:bottom w:w="55" w:type="dxa"/>
+              <w:left w:w="55" w:type="dxa"/>
+              <w:right w:w="55" w:type="dxa"/>
+            </w:tcMar>
+          </w:tcPr>
+          <w:p>
+            <w:pPr>
+              <w:spacing w:after="0" w:line="240" w:lineRule="auto"/>
+              <w:jc w:val="center"/>
+            </w:pPr>
+            <w:r/>
+            <w:r>
+              <w:rPr>
+                <w:rFonts w:ascii="Times New Roman" w:hAnsi="Times New Roman"/>
+                <w:i w:val="0"/>
+                <w:sz w:val="19"/>
+              </w:rPr>
+              <w:t>Yugraj Prabhakar Mangate</w:t>
+              <w:br/>
+            </w:r>
+            <w:r>
+              <w:rPr>
+                <w:rFonts w:ascii="Times New Roman" w:hAnsi="Times New Roman"/>
+                <w:i w:val="0"/>
+                <w:sz w:val="19"/>
+              </w:rPr>
+              <w:t>Department of Computer Engineering</w:t>
+              <w:br/>
+            </w:r>
+            <w:r>
+              <w:rPr>
+                <w:rFonts w:ascii="Times New Roman" w:hAnsi="Times New Roman"/>
+                <w:i w:val="0"/>
+                <w:sz w:val="19"/>
+              </w:rPr>
+              <w:t>International Institute Of Information</w:t>
+              <w:br/>
+              <w:t>Technology</w:t>
+              <w:br/>
+            </w:r>
+            <w:r>
+              <w:rPr>
+                <w:rFonts w:ascii="Times New Roman" w:hAnsi="Times New Roman"/>
+                <w:i/>
+                <w:sz w:val="19"/>
+              </w:rPr>
+              <w:t>Pune, India</w:t>
+              <w:br/>
+            </w:r>
+            <w:r>
+              <w:rPr>
+                <w:rFonts w:ascii="Times New Roman" w:hAnsi="Times New Roman"/>
+                <w:i w:val="0"/>
+                <w:sz w:val="19"/>
+              </w:rPr>
+              <w:t>yugrajmngate@gmail.com</w:t>
+            </w:r>
+          </w:p>
+        </w:tc>
+        <w:tc>
+          <w:tcPr>
+            <w:tcW w:type="dxa" w:w="3427"/>
+            <w:vAlign w:val="top"/>
+            <w:tcBorders>
+              <w:top w:val="nil"/>
+              <w:bottom w:val="nil"/>
+              <w:left w:val="nil"/>
+              <w:right w:val="nil"/>
+              <w:insideH w:val="nil"/>
+              <w:insideV w:val="nil"/>
+            </w:tcBorders>
+            <w:tcMar>
+              <w:top w:w="55" w:type="dxa"/>
+              <w:bottom w:w="55" w:type="dxa"/>
+              <w:left w:w="55" w:type="dxa"/>
+              <w:right w:w="55" w:type="dxa"/>
+            </w:tcMar>
+          </w:tcPr>
+          <w:p>
+            <w:pPr>
+              <w:spacing w:after="0" w:line="240" w:lineRule="auto"/>
+              <w:jc w:val="center"/>
+            </w:pPr>
+            <w:r/>
+            <w:r>
+              <w:rPr>
+                <w:rFonts w:ascii="Times New Roman" w:hAnsi="Times New Roman"/>
+                <w:i w:val="0"/>
+                <w:sz w:val="19"/>
+              </w:rPr>
+              <w:t>Manasvi Manoj Yeole</w:t>
+              <w:br/>
+            </w:r>
+            <w:r>
+              <w:rPr>
+                <w:rFonts w:ascii="Times New Roman" w:hAnsi="Times New Roman"/>
+                <w:i w:val="0"/>
+                <w:sz w:val="19"/>
+              </w:rPr>
+              <w:t>Department of Computer Engineering</w:t>
+              <w:br/>
+            </w:r>
+            <w:r>
+              <w:rPr>
+                <w:rFonts w:ascii="Times New Roman" w:hAnsi="Times New Roman"/>
+                <w:i w:val="0"/>
+                <w:sz w:val="19"/>
+              </w:rPr>
+              <w:t>International Institute Of Information</w:t>
+              <w:br/>
+              <w:t>Technology</w:t>
+              <w:br/>
+            </w:r>
+            <w:r>
+              <w:rPr>
+                <w:rFonts w:ascii="Times New Roman" w:hAnsi="Times New Roman"/>
+                <w:i/>
+                <w:sz w:val="19"/>
+              </w:rPr>
+              <w:t>Pune, India</w:t>
+              <w:br/>
+            </w:r>
+            <w:r>
+              <w:rPr>
+                <w:rFonts w:ascii="Times New Roman" w:hAnsi="Times New Roman"/>
+                <w:i w:val="0"/>
+                <w:sz w:val="19"/>
+              </w:rPr>
+              <w:t>manasviyeole@gmail.com</w:t>
+            </w:r>
+          </w:p>
+        </w:tc>
+        <w:tc>
+          <w:tcPr>
+            <w:tcW w:type="dxa" w:w="3427"/>
+            <w:vAlign w:val="top"/>
+            <w:tcBorders>
+              <w:top w:val="nil"/>
+              <w:bottom w:val="nil"/>
+              <w:left w:val="nil"/>
+              <w:right w:val="nil"/>
+              <w:insideH w:val="nil"/>
+              <w:insideV w:val="nil"/>
+            </w:tcBorders>
+            <w:tcMar>
+              <w:top w:w="55" w:type="dxa"/>
+              <w:bottom w:w="55" w:type="dxa"/>
+              <w:left w:w="55" w:type="dxa"/>
+              <w:right w:w="55" w:type="dxa"/>
+            </w:tcMar>
+          </w:tcPr>
+          <w:p>
+            <w:pPr>
+              <w:spacing w:after="0"/>
+            </w:pPr>
+          </w:p>
+        </w:tc>
+      </w:tr>
+    </w:tbl>
     <w:p>
       <w:pPr>
         <w:pStyle w:val="AuthorData"/>
         <w:widowControl/>
-        <w:jc w:val="center"/>
-      </w:pPr>
-      <w:r>
-        <w:rPr>
-          <w:sz w:val="22"/>
-        </w:rPr>
-        <w:t>Bhagyashri Thorat, Yugraj Prabhakar Mangate, Parth Omprakash Bhad,</w:t>
-        <w:br/>
-        <w:t>Manasvi Manoj Yeole, and Aaditya Shrikrishna Hingmire</w:t>
-      </w:r>
-    </w:p>
-    <w:p>
-      <w:pPr>
-        <w:pStyle w:val="AuthorData"/>
-        <w:widowControl/>
-        <w:jc w:val="center"/>
-      </w:pPr>
-      <w:r>
-        <w:rPr>
-          <w:i/>
-          <w:sz w:val="18"/>
-        </w:rPr>
-        <w:t>International Institute of Information Technology, Pune, India</w:t>
-        <w:br/>
-        <w:t>Electronics and Telecommunication Engineering, Computer Engineering, and Information Technology</w:t>
-        <w:br/>
-        <w:t>Correspondence: parthbhad2@gmail.com</w:t>
-      </w:r>
+        <w:spacing w:after="60"/>
+      </w:pPr>
     </w:p>
     <w:p>
       <w:pPr>
@@ -5246,6 +5629,158 @@
     </w:sectPr>
   </w:body>
 </w:document>
+</file>
+
+<file path=word/comments.xml><?xml version="1.0" encoding="utf-8"?>
+<w:comments xmlns:wpc="http://schemas.microsoft.com/office/word/2010/wordprocessingCanvas" xmlns:cx="http://schemas.microsoft.com/office/drawing/2014/chartex" xmlns:cx1="http://schemas.microsoft.com/office/drawing/2015/9/8/chartex" xmlns:cx2="http://schemas.microsoft.com/office/drawing/2015/10/21/chartex" xmlns:cx3="http://schemas.microsoft.com/office/drawing/2016/5/9/chartex" xmlns:cx4="http://schemas.microsoft.com/office/drawing/2016/5/10/chartex" xmlns:cx5="http://schemas.microsoft.com/office/drawing/2016/5/11/chartex" xmlns:cx6="http://schemas.microsoft.com/office/drawing/2016/5/12/chartex" xmlns:cx7="http://schemas.microsoft.com/office/drawing/2016/5/13/chartex" xmlns:cx8="http://schemas.microsoft.com/office/drawing/2016/5/14/chartex" xmlns:mc="http://schemas.openxmlformats.org/markup-compatibility/2006" xmlns:aink="http://schemas.microsoft.com/office/drawing/2016/ink" xmlns:am3d="http://schemas.microsoft.com/office/drawing/2017/model3d" xmlns:o="urn:schemas-microsoft-com:office:office" xmlns:oel="http://schemas.microsoft.com/office/2019/extlst" xmlns:r="http://schemas.openxmlformats.org/officeDocument/2006/relationships" xmlns:m="http://schemas.openxmlformats.org/officeDocument/2006/math" xmlns:v="urn:schemas-microsoft-com:vml" xmlns:wp14="http://schemas.microsoft.com/office/word/2010/wordprocessingDrawing" xmlns:wp="http://schemas.openxmlformats.org/drawingml/2006/wordprocessingDrawing" xmlns:w10="urn:schemas-microsoft-com:office:word" xmlns:w="http://schemas.openxmlformats.org/wordprocessingml/2006/main" xmlns:w14="http://schemas.microsoft.com/office/word/2010/wordml" xmlns:w15="http://schemas.microsoft.com/office/word/2012/wordml" xmlns:w16cex="http://schemas.microsoft.com/office/word/2018/wordml/cex" xmlns:w16cid="http://schemas.microsoft.com/office/word/2016/wordml/cid" xmlns:w16="http://schemas.microsoft.com/office/word/2018/wordml" xmlns:w16sdtdh="http://schemas.microsoft.com/office/word/2020/wordml/sdtdatahash" xmlns:w16se="http://schemas.microsoft.com/office/word/2015/wordml/symex" xmlns:wpg="http://schemas.microsoft.com/office/word/2010/wordprocessingGroup" xmlns:wpi="http://schemas.microsoft.com/office/word/2010/wordprocessingInk" xmlns:wne="http://schemas.microsoft.com/office/word/2006/wordml" xmlns:wps="http://schemas.microsoft.com/office/word/2010/wordprocessingShape" mc:Ignorable="w14 w15 w16se w16cid w16 w16cex w16sdtdh wp14">
+  <w:comment w:id="2" w:author="Author" w:initials="A">
+    <w:p>
+      <w:pPr>
+        <w:pStyle w:val="CommentText"/>
+      </w:pPr>
+      <w:r>
+        <w:rPr>
+          <w:rStyle w:val="CommentReference"/>
+        </w:rPr>
+        <w:annotationRef/>
+      </w:r>
+      <w:r>
+        <w:rPr>
+          <w:rStyle w:val="CommentReference"/>
+        </w:rPr>
+        <w:annotationRef/>
+      </w:r>
+      <w:r>
+        <w:rPr>
+          <w:rStyle w:val="CommentReference"/>
+        </w:rPr>
+        <w:annotationRef/>
+      </w:r>
+      <w:r>
+        <w:rPr>
+          <w:b/>
+        </w:rPr>
+        <w:t>Do not complete the Author name section until you submit the final camera-ready copy.</w:t>
+      </w:r>
+      <w:r>
+        <w:t xml:space="preserve"> </w:t>
+      </w:r>
+    </w:p>
+    <w:p>
+      <w:pPr>
+        <w:pStyle w:val="CommentText"/>
+      </w:pPr>
+    </w:p>
+    <w:p>
+      <w:pPr>
+        <w:pStyle w:val="Heading1"/>
+        <w:spacing w:before="0"/>
+        <w:rPr>
+          <w:b/>
+          <w:smallCaps w:val="0"/>
+        </w:rPr>
+      </w:pPr>
+      <w:r>
+        <w:rPr>
+          <w:rStyle w:val="CommentReference"/>
+          <w:b/>
+          <w:smallCaps w:val="0"/>
+        </w:rPr>
+        <w:t>Important notice about copyright:</w:t>
+      </w:r>
+    </w:p>
+    <w:p>
+      <w:pPr>
+        <w:pStyle w:val="BodyTextIndent"/>
+        <w:rPr>
+          <w:iCs/>
+        </w:rPr>
+      </w:pPr>
+      <w:r>
+        <w:t xml:space="preserve">During the final paper submission process, you must complete the electronic copyright form. Your paper cannot be published in the Proceedings if you do not complete this step. </w:t>
+      </w:r>
+    </w:p>
+    <w:p>
+      <w:pPr>
+        <w:pStyle w:val="BodyTextIndent"/>
+        <w:rPr>
+          <w:iCs/>
+        </w:rPr>
+      </w:pPr>
+    </w:p>
+    <w:p>
+      <w:pPr>
+        <w:pStyle w:val="BodyTextIndent"/>
+      </w:pPr>
+      <w:r>
+        <w:t xml:space="preserve">There are specific copyright notices for Government agencies. Please contact the Proceedings Co-chairs for the correct statement to include in your paper. </w:t>
+      </w:r>
+    </w:p>
+    <w:p>
+      <w:pPr>
+        <w:pStyle w:val="BodyTextIndent"/>
+      </w:pPr>
+    </w:p>
+    <w:p>
+      <w:pPr>
+        <w:pStyle w:val="CommentText"/>
+      </w:pPr>
+      <w:r>
+        <w:rPr>
+          <w:b/>
+        </w:rPr>
+        <w:t>Delete this comment before submitting your paper for the first review.</w:t>
+      </w:r>
+    </w:p>
+  </w:comment>
+  <w:comment w:id="4" w:author="Author" w:initials="A">
+    <w:p>
+      <w:pPr>
+        <w:pStyle w:val="CommentText"/>
+      </w:pPr>
+      <w:r>
+        <w:rPr>
+          <w:rStyle w:val="CommentReference"/>
+        </w:rPr>
+        <w:annotationRef/>
+      </w:r>
+      <w:r>
+        <w:t>All figures except author photo(s) should be inserted into an otherwise blank paragraph using the Insert —&gt; Photo —&gt; Picture from File command.</w:t>
+      </w:r>
+    </w:p>
+  </w:comment>
+  <w:comment w:id="6" w:author="Author" w:initials="A">
+    <w:p>
+      <w:pPr>
+        <w:pStyle w:val="CommentText"/>
+      </w:pPr>
+      <w:r>
+        <w:rPr>
+          <w:rStyle w:val="CommentReference"/>
+        </w:rPr>
+        <w:annotationRef/>
+      </w:r>
+      <w:r>
+        <w:t xml:space="preserve">Delete the About the Authors section and this comment before submitting your paper for the first review of your full submission. </w:t>
+      </w:r>
+      <w:r>
+        <w:rPr>
+          <w:b/>
+          <w:bCs/>
+        </w:rPr>
+        <w:t>You will need to include this section in your final camera-ready copy, but do not include it before that stage.</w:t>
+      </w:r>
+    </w:p>
+  </w:comment>
+</w:comments>
+</file>
+
+<file path=word/commentsExtended.xml><?xml version="1.0" encoding="utf-8"?>
+<w15:commentsEx xmlns:wpc="http://schemas.microsoft.com/office/word/2010/wordprocessingCanvas" xmlns:cx="http://schemas.microsoft.com/office/drawing/2014/chartex" xmlns:cx1="http://schemas.microsoft.com/office/drawing/2015/9/8/chartex" xmlns:cx2="http://schemas.microsoft.com/office/drawing/2015/10/21/chartex" xmlns:cx3="http://schemas.microsoft.com/office/drawing/2016/5/9/chartex" xmlns:cx4="http://schemas.microsoft.com/office/drawing/2016/5/10/chartex" xmlns:cx5="http://schemas.microsoft.com/office/drawing/2016/5/11/chartex" xmlns:cx6="http://schemas.microsoft.com/office/drawing/2016/5/12/chartex" xmlns:cx7="http://schemas.microsoft.com/office/drawing/2016/5/13/chartex" xmlns:cx8="http://schemas.microsoft.com/office/drawing/2016/5/14/chartex" xmlns:mc="http://schemas.openxmlformats.org/markup-compatibility/2006" xmlns:aink="http://schemas.microsoft.com/office/drawing/2016/ink" xmlns:am3d="http://schemas.microsoft.com/office/drawing/2017/model3d" xmlns:o="urn:schemas-microsoft-com:office:office" xmlns:oel="http://schemas.microsoft.com/office/2019/extlst" xmlns:r="http://schemas.openxmlformats.org/officeDocument/2006/relationships" xmlns:m="http://schemas.openxmlformats.org/officeDocument/2006/math" xmlns:v="urn:schemas-microsoft-com:vml" xmlns:wp14="http://schemas.microsoft.com/office/word/2010/wordprocessingDrawing" xmlns:wp="http://schemas.openxmlformats.org/drawingml/2006/wordprocessingDrawing" xmlns:w10="urn:schemas-microsoft-com:office:word" xmlns:w="http://schemas.openxmlformats.org/wordprocessingml/2006/main" xmlns:w14="http://schemas.microsoft.com/office/word/2010/wordml" xmlns:w15="http://schemas.microsoft.com/office/word/2012/wordml" xmlns:w16cex="http://schemas.microsoft.com/office/word/2018/wordml/cex" xmlns:w16cid="http://schemas.microsoft.com/office/word/2016/wordml/cid" xmlns:w16="http://schemas.microsoft.com/office/word/2018/wordml" xmlns:w16sdtdh="http://schemas.microsoft.com/office/word/2020/wordml/sdtdatahash" xmlns:w16se="http://schemas.microsoft.com/office/word/2015/wordml/symex" xmlns:wpg="http://schemas.microsoft.com/office/word/2010/wordprocessingGroup" xmlns:wpi="http://schemas.microsoft.com/office/word/2010/wordprocessingInk" xmlns:wne="http://schemas.microsoft.com/office/word/2006/wordml" xmlns:wps="http://schemas.microsoft.com/office/word/2010/wordprocessingShape" mc:Ignorable="w14 w15 w16se w16cid w16 w16cex w16sdtdh wp14">
+  <w15:commentEx w15:paraId="756CD972" w15:done="0"/>
+  <w15:commentEx w15:paraId="507178EC" w15:done="0"/>
+  <w15:commentEx w15:paraId="79A3331F" w15:done="0"/>
+</w15:commentsEx>
 </file>
 
 <file path=word/commentsIds.xml><?xml version="1.0" encoding="utf-8"?>

</xml_diff>

<commit_message>
Add Gayatri to EpiControl author list
</commit_message>
<xml_diff>
--- a/paper/EpiControl_AI_IEEE_Manuscript.docx
+++ b/paper/EpiControl_AI_IEEE_Manuscript.docx
@@ -38,7 +38,7 @@
         <w:tc>
           <w:tcPr>
             <w:tcW w:type="dxa" w:w="3427"/>
-            <w:vAlign w:val="center"/>
+            <w:vAlign w:val="top"/>
             <w:tcBorders>
               <w:top w:val="nil"/>
               <w:bottom w:val="nil"/>
@@ -65,7 +65,7 @@
                 <w:rFonts w:ascii="Times New Roman" w:hAnsi="Times New Roman"/>
                 <w:b w:val="0"/>
                 <w:color w:val="000000"/>
-                <w:sz w:val="16"/>
+                <w:sz w:val="15"/>
               </w:rPr>
               <w:t>Prof Bhagyashri Thorat</w:t>
               <w:br/>
@@ -86,7 +86,7 @@
         <w:tc>
           <w:tcPr>
             <w:tcW w:type="dxa" w:w="3427"/>
-            <w:vAlign w:val="center"/>
+            <w:vAlign w:val="top"/>
             <w:tcBorders>
               <w:top w:val="nil"/>
               <w:bottom w:val="nil"/>
@@ -113,7 +113,7 @@
                 <w:rFonts w:ascii="Times New Roman" w:hAnsi="Times New Roman"/>
                 <w:b w:val="0"/>
                 <w:color w:val="000000"/>
-                <w:sz w:val="16"/>
+                <w:sz w:val="15"/>
               </w:rPr>
               <w:t>Parth Omprakash Bhad</w:t>
               <w:br/>
@@ -132,7 +132,7 @@
         <w:tc>
           <w:tcPr>
             <w:tcW w:type="dxa" w:w="3427"/>
-            <w:vAlign w:val="center"/>
+            <w:vAlign w:val="top"/>
             <w:tcBorders>
               <w:top w:val="nil"/>
               <w:bottom w:val="nil"/>
@@ -159,7 +159,7 @@
                 <w:rFonts w:ascii="Times New Roman" w:hAnsi="Times New Roman"/>
                 <w:b w:val="0"/>
                 <w:color w:val="000000"/>
-                <w:sz w:val="16"/>
+                <w:sz w:val="15"/>
               </w:rPr>
               <w:t>Aaditya Shrikrishna Hingmire</w:t>
               <w:br/>
@@ -180,7 +180,7 @@
         <w:tc>
           <w:tcPr>
             <w:tcW w:type="dxa" w:w="3427"/>
-            <w:vAlign w:val="center"/>
+            <w:vAlign w:val="top"/>
             <w:tcBorders>
               <w:top w:val="nil"/>
               <w:bottom w:val="nil"/>
@@ -207,7 +207,7 @@
                 <w:rFonts w:ascii="Times New Roman" w:hAnsi="Times New Roman"/>
                 <w:b w:val="0"/>
                 <w:color w:val="000000"/>
-                <w:sz w:val="16"/>
+                <w:sz w:val="15"/>
               </w:rPr>
               <w:t>Yugraj Prabhakar Mangate</w:t>
               <w:br/>
@@ -226,7 +226,7 @@
         <w:tc>
           <w:tcPr>
             <w:tcW w:type="dxa" w:w="3427"/>
-            <w:vAlign w:val="center"/>
+            <w:vAlign w:val="top"/>
             <w:tcBorders>
               <w:top w:val="nil"/>
               <w:bottom w:val="nil"/>
@@ -253,7 +253,7 @@
                 <w:rFonts w:ascii="Times New Roman" w:hAnsi="Times New Roman"/>
                 <w:b w:val="0"/>
                 <w:color w:val="000000"/>
-                <w:sz w:val="16"/>
+                <w:sz w:val="15"/>
               </w:rPr>
               <w:t>Manasvi Manoj Yeole</w:t>
               <w:br/>
@@ -272,7 +272,7 @@
         <w:tc>
           <w:tcPr>
             <w:tcW w:type="dxa" w:w="3427"/>
-            <w:vAlign w:val="center"/>
+            <w:vAlign w:val="top"/>
             <w:tcBorders>
               <w:top w:val="nil"/>
               <w:bottom w:val="nil"/>
@@ -290,17 +290,27 @@
           </w:tcPr>
           <w:p>
             <w:pPr>
-              <w:spacing w:line="240" w:lineRule="auto" w:after="0"/>
+              <w:spacing w:after="0" w:line="240" w:lineRule="auto"/>
               <w:ind w:firstLine="0"/>
               <w:jc w:val="center"/>
             </w:pPr>
             <w:r>
               <w:rPr>
                 <w:rFonts w:ascii="Times New Roman" w:hAnsi="Times New Roman"/>
-                <w:b w:val="0"/>
                 <w:color w:val="000000"/>
-                <w:sz w:val="16"/>
+                <w:sz w:val="15"/>
               </w:rPr>
+              <w:t>Gayatri Sanjay Karanjkar</w:t>
+              <w:br/>
+              <w:t>Department of Computer Engineering</w:t>
+              <w:br/>
+              <w:t>International Institute Of Information</w:t>
+              <w:br/>
+              <w:t>Technology</w:t>
+              <w:br/>
+              <w:t>Pune, India</w:t>
+              <w:br/>
+              <w:t>gayatrikaranjkar2812@gmail.com</w:t>
             </w:r>
           </w:p>
         </w:tc>

</xml_diff>